<commit_message>
chore(assets): clean up whitespace and formatting in SLIP document
- Remove excess blank lines before director signature section
- Consolidate spacing around entrance slip header
- Remove trailing blank lines after director information
- Improve document formatting consistency and readability
</commit_message>
<xml_diff>
--- a/app/assets/SLIP.docx
+++ b/app/assets/SLIP.docx
@@ -1225,78 +1225,6 @@
           <w:numId w:val="0"/>
         </w:numPr>
         <w:ind w:leftChars="0"/>
-        <w:rPr>
-          <w:rFonts w:cstheme="minorHAnsi"/>
-          <w:sz w:val="15"/>
-          <w:szCs w:val="15"/>
-        </w:rPr>
-      </w:pPr>
-    </w:p>
-    <w:p>
-      <w:pPr>
-        <w:pStyle w:val="6"/>
-        <w:numPr>
-          <w:ilvl w:val="0"/>
-          <w:numId w:val="0"/>
-        </w:numPr>
-        <w:tabs>
-          <w:tab w:val="left" w:pos="420"/>
-        </w:tabs>
-        <w:spacing w:after="0" w:line="240" w:lineRule="auto"/>
-        <w:rPr>
-          <w:rFonts w:cstheme="minorHAnsi"/>
-          <w:sz w:val="15"/>
-          <w:szCs w:val="15"/>
-        </w:rPr>
-      </w:pPr>
-    </w:p>
-    <w:p>
-      <w:pPr>
-        <w:pStyle w:val="6"/>
-        <w:numPr>
-          <w:ilvl w:val="0"/>
-          <w:numId w:val="0"/>
-        </w:numPr>
-        <w:tabs>
-          <w:tab w:val="left" w:pos="420"/>
-        </w:tabs>
-        <w:spacing w:after="0" w:line="240" w:lineRule="auto"/>
-        <w:rPr>
-          <w:rFonts w:cstheme="minorHAnsi"/>
-          <w:sz w:val="15"/>
-          <w:szCs w:val="15"/>
-        </w:rPr>
-      </w:pPr>
-    </w:p>
-    <w:p>
-      <w:pPr>
-        <w:pStyle w:val="6"/>
-        <w:numPr>
-          <w:ilvl w:val="0"/>
-          <w:numId w:val="0"/>
-        </w:numPr>
-        <w:tabs>
-          <w:tab w:val="left" w:pos="420"/>
-        </w:tabs>
-        <w:spacing w:after="0" w:line="240" w:lineRule="auto"/>
-        <w:rPr>
-          <w:rFonts w:cstheme="minorHAnsi"/>
-          <w:sz w:val="15"/>
-          <w:szCs w:val="15"/>
-        </w:rPr>
-      </w:pPr>
-    </w:p>
-    <w:p>
-      <w:pPr>
-        <w:pStyle w:val="6"/>
-        <w:numPr>
-          <w:ilvl w:val="0"/>
-          <w:numId w:val="0"/>
-        </w:numPr>
-        <w:tabs>
-          <w:tab w:val="left" w:pos="420"/>
-        </w:tabs>
-        <w:spacing w:after="0" w:line="240" w:lineRule="auto"/>
         <w:rPr>
           <w:rFonts w:cstheme="minorHAnsi"/>
           <w:sz w:val="15"/>
@@ -1544,8 +1472,38 @@
           <w:lang w:val="en-US"/>
         </w:rPr>
       </w:pPr>
+    </w:p>
+    <w:p>
+      <w:pPr>
+        <w:spacing w:line="240" w:lineRule="auto"/>
+        <w:jc w:val="both"/>
+        <w:rPr>
+          <w:rFonts w:hint="default"/>
+          <w:b/>
+          <w:bCs/>
+          <w:sz w:val="15"/>
+          <w:szCs w:val="15"/>
+          <w:u w:val="none"/>
+          <w:lang w:val="en-US"/>
+        </w:rPr>
+      </w:pPr>
       <w:bookmarkStart w:id="0" w:name="_GoBack"/>
       <w:bookmarkEnd w:id="0"/>
+    </w:p>
+    <w:p>
+      <w:pPr>
+        <w:spacing w:line="240" w:lineRule="auto"/>
+        <w:jc w:val="both"/>
+        <w:rPr>
+          <w:rFonts w:hint="default"/>
+          <w:b/>
+          <w:bCs/>
+          <w:sz w:val="15"/>
+          <w:szCs w:val="15"/>
+          <w:u w:val="none"/>
+          <w:lang w:val="en-US"/>
+        </w:rPr>
+      </w:pPr>
     </w:p>
     <w:p>
       <w:pPr>
@@ -2747,33 +2705,6 @@
           <w:rFonts w:cstheme="minorHAnsi"/>
           <w:b/>
           <w:bCs/>
-          <w:sz w:val="15"/>
-          <w:szCs w:val="15"/>
-        </w:rPr>
-      </w:pPr>
-    </w:p>
-    <w:p>
-      <w:pPr>
-        <w:jc w:val="both"/>
-        <w:rPr>
-          <w:sz w:val="15"/>
-          <w:szCs w:val="15"/>
-        </w:rPr>
-      </w:pPr>
-    </w:p>
-    <w:p>
-      <w:pPr>
-        <w:jc w:val="both"/>
-        <w:rPr>
-          <w:sz w:val="15"/>
-          <w:szCs w:val="15"/>
-        </w:rPr>
-      </w:pPr>
-    </w:p>
-    <w:p>
-      <w:pPr>
-        <w:jc w:val="both"/>
-        <w:rPr>
           <w:sz w:val="15"/>
           <w:szCs w:val="15"/>
         </w:rPr>

</xml_diff>